<commit_message>
Actualización sobre la documentación
</commit_message>
<xml_diff>
--- a/Proyecto Final.docx
+++ b/Proyecto Final.docx
@@ -70,10 +70,10 @@
         <w:tblLook w:val="04A0" w:firstRow="1" w:lastRow="0" w:firstColumn="1" w:lastColumn="0" w:noHBand="0" w:noVBand="1"/>
       </w:tblPr>
       <w:tblGrid>
-        <w:gridCol w:w="2207"/>
-        <w:gridCol w:w="1832"/>
-        <w:gridCol w:w="1720"/>
-        <w:gridCol w:w="2883"/>
+        <w:gridCol w:w="2178"/>
+        <w:gridCol w:w="2214"/>
+        <w:gridCol w:w="1722"/>
+        <w:gridCol w:w="2714"/>
       </w:tblGrid>
       <w:tr>
         <w:tc>
@@ -169,13 +169,8 @@
             </w:r>
           </w:p>
           <w:p>
-            <w:proofErr w:type="gramStart"/>
-            <w:r>
-              <w:t>VARCHAR(</w:t>
-            </w:r>
-            <w:proofErr w:type="gramEnd"/>
-            <w:r>
-              <w:t>50)</w:t>
+            <w:r>
+              <w:t>VARCHAR(50)</w:t>
             </w:r>
           </w:p>
           <w:p>
@@ -260,6 +255,11 @@
               <w:t>Unidad_medida</w:t>
             </w:r>
           </w:p>
+          <w:p>
+            <w:r>
+              <w:t>Valor_max</w:t>
+            </w:r>
+          </w:p>
         </w:tc>
         <w:tc>
           <w:tcPr>
@@ -276,23 +276,18 @@
             </w:r>
           </w:p>
           <w:p>
-            <w:proofErr w:type="gramStart"/>
-            <w:r>
-              <w:t>VARCHAR(</w:t>
-            </w:r>
-            <w:proofErr w:type="gramEnd"/>
-            <w:r>
-              <w:t>100)</w:t>
-            </w:r>
-          </w:p>
-          <w:p>
-            <w:proofErr w:type="gramStart"/>
-            <w:r>
-              <w:t>VARCHAR(</w:t>
-            </w:r>
-            <w:proofErr w:type="gramEnd"/>
-            <w:r>
-              <w:t>30)</w:t>
+            <w:r>
+              <w:t>VARCHAR(100)</w:t>
+            </w:r>
+          </w:p>
+          <w:p>
+            <w:r>
+              <w:t>VARCHAR(30)</w:t>
+            </w:r>
+          </w:p>
+          <w:p>
+            <w:r>
+              <w:t>NUMERIC(20,10)</w:t>
             </w:r>
           </w:p>
         </w:tc>
@@ -388,13 +383,8 @@
             </w:r>
           </w:p>
           <w:p>
-            <w:proofErr w:type="gramStart"/>
-            <w:r>
-              <w:t>VARCHAR(</w:t>
-            </w:r>
-            <w:proofErr w:type="gramEnd"/>
-            <w:r>
-              <w:t>100)</w:t>
+            <w:r>
+              <w:t>VARCHAR(100)</w:t>
             </w:r>
           </w:p>
           <w:p>
@@ -518,13 +508,8 @@
             </w:r>
           </w:p>
           <w:p>
-            <w:proofErr w:type="gramStart"/>
-            <w:r>
-              <w:t>NUMERIC(</w:t>
-            </w:r>
-            <w:proofErr w:type="gramEnd"/>
-            <w:r>
-              <w:t>15,4)</w:t>
+            <w:r>
+              <w:t>NUMERIC(15,4)</w:t>
             </w:r>
           </w:p>
         </w:tc>
@@ -725,7 +710,11 @@
           <w:p/>
           <w:p>
             <w:r>
-              <w:t>ESTA TABLA HA SIDO AUTOMATIZADO MEDIANTE UN PROCEDIMIENTO ALMACENADO</w:t>
+              <w:t xml:space="preserve">ESTA TABLA HA SIDO AUTOMATIZADO MEDIANTE UN </w:t>
+            </w:r>
+            <w:r>
+              <w:lastRenderedPageBreak/>
+              <w:t>PROCEDIMIENTO ALMACENADO</w:t>
             </w:r>
           </w:p>
         </w:tc>
@@ -801,13 +790,8 @@
             </w:r>
           </w:p>
           <w:p>
-            <w:proofErr w:type="gramStart"/>
-            <w:r>
-              <w:t>NUMERIC(</w:t>
-            </w:r>
-            <w:proofErr w:type="gramEnd"/>
-            <w:r>
-              <w:t>18,4)</w:t>
+            <w:r>
+              <w:t>NUMERIC(18,4)</w:t>
             </w:r>
           </w:p>
         </w:tc>
@@ -879,12 +863,533 @@
             </w:r>
             <w:r>
               <w:t>UTOMATIZADO MEDIANTE UN PROCEDIMIENTO ALMACENADO</w:t>
+            </w:r>
+          </w:p>
+        </w:tc>
+      </w:tr>
+      <w:tr>
+        <w:tc>
+          <w:tcPr>
+            <w:tcW w:w="2207" w:type="dxa"/>
+            <w:vAlign w:val="center"/>
+          </w:tcPr>
+          <w:p>
+            <w:pPr>
+              <w:jc w:val="right"/>
+            </w:pPr>
+            <w:r>
+              <w:t>RELACION_CAUSAL</w:t>
+            </w:r>
+          </w:p>
+        </w:tc>
+        <w:tc>
+          <w:tcPr>
+            <w:tcW w:w="1832" w:type="dxa"/>
+          </w:tcPr>
+          <w:p>
+            <w:r>
+              <w:t>Id_rcausa</w:t>
+            </w:r>
+          </w:p>
+          <w:p>
+            <w:r>
+              <w:t>Id_variable_afectada</w:t>
+            </w:r>
+          </w:p>
+          <w:p>
+            <w:r>
+              <w:t>Id_variable_influyente</w:t>
+            </w:r>
+          </w:p>
+          <w:p>
+            <w:r>
+              <w:t>Tipo</w:t>
+            </w:r>
+          </w:p>
+          <w:p>
+            <w:r>
+              <w:t>Coeficiente</w:t>
+            </w:r>
+          </w:p>
+          <w:p>
+            <w:r>
+              <w:t>Tiene_nv_propio</w:t>
+            </w:r>
+          </w:p>
+        </w:tc>
+        <w:tc>
+          <w:tcPr>
+            <w:tcW w:w="1720" w:type="dxa"/>
+          </w:tcPr>
+          <w:p>
+            <w:r>
+              <w:t>INT</w:t>
+            </w:r>
+          </w:p>
+          <w:p>
+            <w:r>
+              <w:t>INT</w:t>
+            </w:r>
+          </w:p>
+          <w:p>
+            <w:r>
+              <w:t>INT</w:t>
+            </w:r>
+          </w:p>
+          <w:p>
+            <w:r>
+              <w:t>VARCHAR(6)</w:t>
+            </w:r>
+          </w:p>
+          <w:p>
+            <w:r>
+              <w:t>NUMERIC(20,12)</w:t>
+            </w:r>
+          </w:p>
+          <w:p>
+            <w:r>
+              <w:t>BOOLEAN</w:t>
+            </w:r>
+          </w:p>
+        </w:tc>
+        <w:tc>
+          <w:tcPr>
+            <w:tcW w:w="2883" w:type="dxa"/>
+          </w:tcPr>
+          <w:p>
+            <w:r>
+              <w:t>PK, NOT NULL</w:t>
+            </w:r>
+          </w:p>
+          <w:p>
+            <w:r>
+              <w:t>FK(VARIABLE), NOT NULL</w:t>
+            </w:r>
+          </w:p>
+          <w:p>
+            <w:pPr>
+              <w:rPr>
+                <w:lang w:val="en-US"/>
+              </w:rPr>
+            </w:pPr>
+            <w:r>
+              <w:rPr>
+                <w:lang w:val="en-US"/>
+              </w:rPr>
+              <w:t>FK(VARIABLE), NOT NULL</w:t>
+            </w:r>
+          </w:p>
+          <w:p>
+            <w:pPr>
+              <w:rPr>
+                <w:lang w:val="en-US"/>
+              </w:rPr>
+            </w:pPr>
+            <w:r>
+              <w:rPr>
+                <w:lang w:val="en-US"/>
+              </w:rPr>
+              <w:t>N</w:t>
+            </w:r>
+            <w:r>
+              <w:rPr>
+                <w:lang w:val="en-US"/>
+              </w:rPr>
+              <w:t>OT NULL, CHECK (I/O)</w:t>
+            </w:r>
+          </w:p>
+          <w:p>
+            <w:pPr>
+              <w:rPr>
+                <w:lang w:val="en-US"/>
+              </w:rPr>
+            </w:pPr>
+            <w:r>
+              <w:rPr>
+                <w:lang w:val="en-US"/>
+              </w:rPr>
+              <w:t>NOT NULL</w:t>
+            </w:r>
+          </w:p>
+          <w:p>
+            <w:pPr>
+              <w:rPr>
+                <w:lang w:val="en-US"/>
+              </w:rPr>
+            </w:pPr>
+            <w:r>
+              <w:rPr>
+                <w:lang w:val="en-US"/>
+              </w:rPr>
+              <w:t>NOT NULL DEFAULT FALSE</w:t>
+            </w:r>
+          </w:p>
+        </w:tc>
+      </w:tr>
+      <w:tr>
+        <w:tc>
+          <w:tcPr>
+            <w:tcW w:w="2207" w:type="dxa"/>
+            <w:vAlign w:val="center"/>
+          </w:tcPr>
+          <w:p>
+            <w:pPr>
+              <w:jc w:val="right"/>
+            </w:pPr>
+            <w:r>
+              <w:t>RELACION_AUXILIAR</w:t>
+            </w:r>
+          </w:p>
+        </w:tc>
+        <w:tc>
+          <w:tcPr>
+            <w:tcW w:w="1832" w:type="dxa"/>
+          </w:tcPr>
+          <w:p>
+            <w:r>
+              <w:t>Id_raux</w:t>
+            </w:r>
+          </w:p>
+          <w:p>
+            <w:r>
+              <w:t>Id_variable_auxiliar</w:t>
+            </w:r>
+          </w:p>
+          <w:p>
+            <w:r>
+              <w:t>Id_variable_base</w:t>
+            </w:r>
+          </w:p>
+          <w:p>
+            <w:r>
+              <w:t>coeficiente</w:t>
+            </w:r>
+          </w:p>
+        </w:tc>
+        <w:tc>
+          <w:tcPr>
+            <w:tcW w:w="1720" w:type="dxa"/>
+          </w:tcPr>
+          <w:p>
+            <w:r>
+              <w:t>INT</w:t>
+            </w:r>
+          </w:p>
+          <w:p>
+            <w:r>
+              <w:t>INT</w:t>
+            </w:r>
+          </w:p>
+          <w:p>
+            <w:r>
+              <w:t>INT</w:t>
+            </w:r>
+          </w:p>
+          <w:p>
+            <w:r>
+              <w:t>NUMERIC(20,12)</w:t>
+            </w:r>
+          </w:p>
+        </w:tc>
+        <w:tc>
+          <w:tcPr>
+            <w:tcW w:w="2883" w:type="dxa"/>
+          </w:tcPr>
+          <w:p>
+            <w:pPr>
+              <w:rPr>
+                <w:lang w:val="en-US"/>
+              </w:rPr>
+            </w:pPr>
+            <w:r>
+              <w:rPr>
+                <w:lang w:val="en-US"/>
+              </w:rPr>
+              <w:t>PK, NOT NULL</w:t>
+            </w:r>
+          </w:p>
+          <w:p>
+            <w:pPr>
+              <w:rPr>
+                <w:lang w:val="en-US"/>
+              </w:rPr>
+            </w:pPr>
+            <w:r>
+              <w:rPr>
+                <w:lang w:val="en-US"/>
+              </w:rPr>
+              <w:t>FK(VARIABLE), NOT NULL</w:t>
+            </w:r>
+          </w:p>
+          <w:p>
+            <w:pPr>
+              <w:rPr>
+                <w:lang w:val="en-US"/>
+              </w:rPr>
+            </w:pPr>
+            <w:r>
+              <w:rPr>
+                <w:lang w:val="en-US"/>
+              </w:rPr>
+              <w:t>FK(VARIABLE), NOT NULL</w:t>
+            </w:r>
+          </w:p>
+          <w:p>
+            <w:pPr>
+              <w:rPr>
+                <w:lang w:val="en-US"/>
+              </w:rPr>
+            </w:pPr>
+            <w:r>
+              <w:rPr>
+                <w:lang w:val="en-US"/>
+              </w:rPr>
+              <w:t>NOT NULL</w:t>
+            </w:r>
+          </w:p>
+        </w:tc>
+      </w:tr>
+      <w:tr>
+        <w:tc>
+          <w:tcPr>
+            <w:tcW w:w="2207" w:type="dxa"/>
+            <w:vAlign w:val="center"/>
+          </w:tcPr>
+          <w:p>
+            <w:pPr>
+              <w:jc w:val="right"/>
+            </w:pPr>
+            <w:r>
+              <w:t>TABLA_LOOKUP</w:t>
+            </w:r>
+          </w:p>
+        </w:tc>
+        <w:tc>
+          <w:tcPr>
+            <w:tcW w:w="1832" w:type="dxa"/>
+          </w:tcPr>
+          <w:p>
+            <w:r>
+              <w:t>Id_lookup</w:t>
+            </w:r>
+          </w:p>
+          <w:p>
+            <w:r>
+              <w:t>Id_variable_nv</w:t>
+            </w:r>
+          </w:p>
+          <w:p>
+            <w:r>
+              <w:t>Id_variable_con</w:t>
+            </w:r>
+          </w:p>
+          <w:p>
+            <w:r>
+              <w:t>Umbral_max</w:t>
+            </w:r>
+          </w:p>
+          <w:p>
+            <w:r>
+              <w:t>Tasa</w:t>
+            </w:r>
+          </w:p>
+          <w:p>
+            <w:r>
+              <w:t>orden</w:t>
+            </w:r>
+          </w:p>
+        </w:tc>
+        <w:tc>
+          <w:tcPr>
+            <w:tcW w:w="1720" w:type="dxa"/>
+          </w:tcPr>
+          <w:p>
+            <w:r>
+              <w:t>INT</w:t>
+            </w:r>
+          </w:p>
+          <w:p>
+            <w:r>
+              <w:t>INT</w:t>
+            </w:r>
+          </w:p>
+          <w:p>
+            <w:r>
+              <w:t>INT</w:t>
+            </w:r>
+          </w:p>
+          <w:p>
+            <w:r>
+              <w:t>NUMERIC(20,10)</w:t>
+            </w:r>
+          </w:p>
+          <w:p>
+            <w:r>
+              <w:t>NUMERIC(12,8)</w:t>
+            </w:r>
+          </w:p>
+          <w:p>
+            <w:r>
+              <w:t>INT</w:t>
+            </w:r>
+          </w:p>
+        </w:tc>
+        <w:tc>
+          <w:tcPr>
+            <w:tcW w:w="2883" w:type="dxa"/>
+          </w:tcPr>
+          <w:p>
+            <w:pPr>
+              <w:rPr>
+                <w:lang w:val="en-US"/>
+              </w:rPr>
+            </w:pPr>
+            <w:r>
+              <w:rPr>
+                <w:lang w:val="en-US"/>
+              </w:rPr>
+              <w:t>PK, NOT NULL</w:t>
+            </w:r>
+          </w:p>
+          <w:p>
+            <w:pPr>
+              <w:rPr>
+                <w:lang w:val="en-US"/>
+              </w:rPr>
+            </w:pPr>
+            <w:r>
+              <w:rPr>
+                <w:lang w:val="en-US"/>
+              </w:rPr>
+              <w:t>FK(VARIABLE), NOT NULL</w:t>
+            </w:r>
+          </w:p>
+          <w:p>
+            <w:pPr>
+              <w:rPr>
+                <w:lang w:val="en-US"/>
+              </w:rPr>
+            </w:pPr>
+            <w:r>
+              <w:rPr>
+                <w:lang w:val="en-US"/>
+              </w:rPr>
+              <w:t>FK(VARIABLE), NOT NULL</w:t>
+            </w:r>
+          </w:p>
+          <w:p>
+            <w:pPr>
+              <w:rPr>
+                <w:lang w:val="en-US"/>
+              </w:rPr>
+            </w:pPr>
+          </w:p>
+          <w:p>
+            <w:pPr>
+              <w:rPr>
+                <w:lang w:val="en-US"/>
+              </w:rPr>
+            </w:pPr>
+            <w:r>
+              <w:rPr>
+                <w:lang w:val="en-US"/>
+              </w:rPr>
+              <w:t>NOT NULL</w:t>
+            </w:r>
+          </w:p>
+          <w:p>
+            <w:pPr>
+              <w:rPr>
+                <w:lang w:val="en-US"/>
+              </w:rPr>
+            </w:pPr>
+            <w:r>
+              <w:rPr>
+                <w:lang w:val="en-US"/>
+              </w:rPr>
+              <w:t>NOT NULL</w:t>
             </w:r>
           </w:p>
         </w:tc>
       </w:tr>
     </w:tbl>
-    <w:p/>
+    <w:p>
+      <w:pPr>
+        <w:rPr>
+          <w:lang w:val="en-US"/>
+        </w:rPr>
+      </w:pPr>
+    </w:p>
+    <w:p>
+      <w:pPr>
+        <w:rPr>
+          <w:lang w:val="en-US"/>
+        </w:rPr>
+      </w:pPr>
+    </w:p>
+    <w:p>
+      <w:pPr>
+        <w:rPr>
+          <w:lang w:val="en-US"/>
+        </w:rPr>
+      </w:pPr>
+    </w:p>
+    <w:p>
+      <w:pPr>
+        <w:rPr>
+          <w:lang w:val="en-US"/>
+        </w:rPr>
+      </w:pPr>
+    </w:p>
+    <w:p>
+      <w:pPr>
+        <w:rPr>
+          <w:lang w:val="en-US"/>
+        </w:rPr>
+      </w:pPr>
+    </w:p>
+    <w:p>
+      <w:pPr>
+        <w:rPr>
+          <w:lang w:val="en-US"/>
+        </w:rPr>
+      </w:pPr>
+    </w:p>
+    <w:p>
+      <w:pPr>
+        <w:rPr>
+          <w:lang w:val="en-US"/>
+        </w:rPr>
+      </w:pPr>
+    </w:p>
+    <w:p>
+      <w:pPr>
+        <w:rPr>
+          <w:lang w:val="en-US"/>
+        </w:rPr>
+      </w:pPr>
+    </w:p>
+    <w:p>
+      <w:pPr>
+        <w:rPr>
+          <w:lang w:val="en-US"/>
+        </w:rPr>
+      </w:pPr>
+    </w:p>
+    <w:p>
+      <w:pPr>
+        <w:rPr>
+          <w:lang w:val="en-US"/>
+        </w:rPr>
+      </w:pPr>
+    </w:p>
+    <w:p>
+      <w:pPr>
+        <w:rPr>
+          <w:lang w:val="en-US"/>
+        </w:rPr>
+      </w:pPr>
+    </w:p>
     <w:p>
       <w:pPr>
         <w:pStyle w:val="Subttulo"/>
@@ -896,6 +1401,7 @@
         <w:rPr>
           <w:rFonts w:ascii="Cambria" w:hAnsi="Cambria"/>
         </w:rPr>
+        <w:lastRenderedPageBreak/>
         <w:t>Entidades</w:t>
       </w:r>
     </w:p>
@@ -904,14 +1410,11 @@
         <w:jc w:val="center"/>
       </w:pPr>
       <w:r>
-        <w:rPr>
-          <w:noProof/>
-        </w:rPr>
         <w:drawing>
-          <wp:inline distT="0" distB="0" distL="0" distR="0" wp14:anchorId="1D3FEB0D" wp14:editId="442213A2">
-            <wp:extent cx="3652579" cy="3095625"/>
-            <wp:effectExtent l="0" t="0" r="5080" b="0"/>
-            <wp:docPr id="1470154575" name="Imagen 1"/>
+          <wp:inline distT="0" distB="0" distL="0" distR="0" wp14:anchorId="11D28733" wp14:editId="5DBC1BE7">
+            <wp:extent cx="4259582" cy="4095750"/>
+            <wp:effectExtent l="0" t="0" r="7620" b="0"/>
+            <wp:docPr id="2118689530" name="Imagen 1"/>
             <wp:cNvGraphicFramePr>
               <a:graphicFrameLocks xmlns:a="http://schemas.openxmlformats.org/drawingml/2006/main" noChangeAspect="1"/>
             </wp:cNvGraphicFramePr>
@@ -919,7 +1422,7 @@
               <a:graphicData uri="http://schemas.openxmlformats.org/drawingml/2006/picture">
                 <pic:pic xmlns:pic="http://schemas.openxmlformats.org/drawingml/2006/picture">
                   <pic:nvPicPr>
-                    <pic:cNvPr id="1470154575" name=""/>
+                    <pic:cNvPr id="2118689530" name=""/>
                     <pic:cNvPicPr/>
                   </pic:nvPicPr>
                   <pic:blipFill>
@@ -931,7 +1434,7 @@
                   <pic:spPr>
                     <a:xfrm>
                       <a:off x="0" y="0"/>
-                      <a:ext cx="3668285" cy="3108936"/>
+                      <a:ext cx="4269272" cy="4105067"/>
                     </a:xfrm>
                     <a:prstGeom prst="rect">
                       <a:avLst/>
@@ -1021,15 +1524,7 @@
         <w:t xml:space="preserve">Parámetro. </w:t>
       </w:r>
       <w:r>
-        <w:t xml:space="preserve">Esta tabla resuelve la relación </w:t>
-      </w:r>
-      <w:proofErr w:type="gramStart"/>
-      <w:r>
-        <w:t>M:N</w:t>
-      </w:r>
-      <w:proofErr w:type="gramEnd"/>
-      <w:r>
-        <w:t xml:space="preserve"> de Escenario y Variable. Son los valores iniciales preestablecidos por MÍ desde el año de inicio.</w:t>
+        <w:t>Esta tabla resuelve la relación M:N de Escenario y Variable. Son los valores iniciales preestablecidos por MÍ desde el año de inicio.</w:t>
       </w:r>
     </w:p>
     <w:p>
@@ -1077,6 +1572,76 @@
     </w:p>
     <w:p>
       <w:pPr>
+        <w:pStyle w:val="Prrafodelista"/>
+        <w:numPr>
+          <w:ilvl w:val="0"/>
+          <w:numId w:val="2"/>
+        </w:numPr>
+        <w:jc w:val="both"/>
+      </w:pPr>
+      <w:r>
+        <w:rPr>
+          <w:b/>
+          <w:bCs/>
+        </w:rPr>
+        <w:t>Relación Causal.</w:t>
+      </w:r>
+      <w:r>
+        <w:t xml:space="preserve"> Define los flujos que cambia una variable nivel de un año al siguiente: de dónde viene el aumento (INPUT) o la disminución (OUTPUT), con qué peso (COEFICIENTE) y si el flujo depende del valor actual de la propia variable afectada. Es la implementación directa de la ecuación dinámica de sistemas: NIVEL(T+1) = NIVEL(T) + (INPUT - OUTPUT).</w:t>
+      </w:r>
+    </w:p>
+    <w:p>
+      <w:pPr>
+        <w:pStyle w:val="Prrafodelista"/>
+        <w:numPr>
+          <w:ilvl w:val="0"/>
+          <w:numId w:val="2"/>
+        </w:numPr>
+        <w:jc w:val="both"/>
+      </w:pPr>
+      <w:r>
+        <w:rPr>
+          <w:b/>
+          <w:bCs/>
+        </w:rPr>
+        <w:lastRenderedPageBreak/>
+        <w:t xml:space="preserve">Relación Auxiliar. </w:t>
+      </w:r>
+      <w:r>
+        <w:t>Variables que no acumulan cambios por sí mismas, sino que se recalculan cada año directo a partir de otra variable. En términos de dinámica de sistemas, esto es una “variable auxiliar”, distinta de un “nivel/stock”.</w:t>
+      </w:r>
+    </w:p>
+    <w:p>
+      <w:pPr>
+        <w:pStyle w:val="Prrafodelista"/>
+        <w:numPr>
+          <w:ilvl w:val="0"/>
+          <w:numId w:val="2"/>
+        </w:numPr>
+        <w:jc w:val="both"/>
+      </w:pPr>
+      <w:r>
+        <w:rPr>
+          <w:b/>
+          <w:bCs/>
+        </w:rPr>
+        <w:t>Tabla de Búsquedas.</w:t>
+      </w:r>
+      <w:r>
+        <w:t xml:space="preserve"> Modificadores de tasa que dependen de un umbral en otra variable; el mecanismo que usa World3 para relaciones no lineales, u</w:t>
+      </w:r>
+      <w:r>
+        <w:t>s</w:t>
+      </w:r>
+      <w:r>
+        <w:t>ado para el freno de crecimiento</w:t>
+      </w:r>
+      <w:r>
+        <w:t xml:space="preserve"> poblacional por escasez de recursos.</w:t>
+      </w:r>
+    </w:p>
+    <w:p>
+      <w:pPr>
         <w:pStyle w:val="Subttulo"/>
         <w:rPr>
           <w:rFonts w:ascii="Cambria" w:hAnsi="Cambria"/>
@@ -1086,7 +1651,6 @@
         <w:rPr>
           <w:rFonts w:ascii="Cambria" w:hAnsi="Cambria"/>
         </w:rPr>
-        <w:lastRenderedPageBreak/>
         <w:t>Relaciones</w:t>
       </w:r>
     </w:p>
@@ -1099,15 +1663,7 @@
         </w:numPr>
       </w:pPr>
       <w:r>
-        <w:t>Sector y Variable (</w:t>
-      </w:r>
-      <w:proofErr w:type="gramStart"/>
-      <w:r>
-        <w:t>1:N</w:t>
-      </w:r>
-      <w:proofErr w:type="gramEnd"/>
-      <w:r>
-        <w:t>). Un sector puede agrupar muchas variables (por ejemplo, el sector de Población agrupa variables como Tasa de Natalidad, Tasa de Mortalidad y Población Total). Una variable pertenece única y exclusivamente a un sector.</w:t>
+        <w:t>Sector y Variable (1:N). Un sector puede agrupar muchas variables (por ejemplo, el sector de Población agrupa variables como Tasa de Natalidad, Tasa de Mortalidad y Población Total). Una variable pertenece única y exclusivamente a un sector.</w:t>
       </w:r>
     </w:p>
     <w:p>
@@ -1119,15 +1675,7 @@
         </w:numPr>
       </w:pPr>
       <w:r>
-        <w:t>Escenario y Parámetros (</w:t>
-      </w:r>
-      <w:proofErr w:type="gramStart"/>
-      <w:r>
-        <w:t>1:N</w:t>
-      </w:r>
-      <w:proofErr w:type="gramEnd"/>
-      <w:r>
-        <w:t>). Un escenario puede tener muchos parámetros o condiciones iniciales configuradas. Por ejemplo: En el escenario de Tecnología Limpia, configuras límites de contaminación, eficiencia de reciclaje, etc. Un parámetro específico configurado pertenece a un solo escenario.</w:t>
+        <w:t>Escenario y Parámetros (1:N). Un escenario puede tener muchos parámetros o condiciones iniciales configuradas. Por ejemplo: En el escenario de Tecnología Limpia, configuras límites de contaminación, eficiencia de reciclaje, etc. Un parámetro específico configurado pertenece a un solo escenario.</w:t>
       </w:r>
     </w:p>
     <w:p>
@@ -1139,15 +1687,7 @@
         </w:numPr>
       </w:pPr>
       <w:r>
-        <w:t>Variables y Parámetros (</w:t>
-      </w:r>
-      <w:proofErr w:type="gramStart"/>
-      <w:r>
-        <w:t>1:N</w:t>
-      </w:r>
-      <w:proofErr w:type="gramEnd"/>
-      <w:r>
-        <w:t>). Una variable puede ser parametrizada muchas veces a lo largo de diferentes escenarios. Por ejemplo: La Variable de Capital Industrial se puede ajustar en el Escenario 1, 2, etc. Pero un parámetro en la tabla intermedia se refiere a una sola variable.</w:t>
+        <w:t>Variables y Parámetros (1:N). Una variable puede ser parametrizada muchas veces a lo largo de diferentes escenarios. Por ejemplo: La Variable de Capital Industrial se puede ajustar en el Escenario 1, 2, etc. Pero un parámetro en la tabla intermedia se refiere a una sola variable.</w:t>
       </w:r>
     </w:p>
     <w:p>
@@ -1171,15 +1711,7 @@
         </w:numPr>
       </w:pPr>
       <w:r>
-        <w:t>Escenario y Simulación (</w:t>
-      </w:r>
-      <w:proofErr w:type="gramStart"/>
-      <w:r>
-        <w:t>1:N</w:t>
-      </w:r>
-      <w:proofErr w:type="gramEnd"/>
-      <w:r>
-        <w:t>). Un escenario puede ser ejecutado o simulado muchas veces. Por ejemplo: si cambias el software de simulación o quieres correr de nuevo la misma hipótesis en fechas distintas. Una simulación proviene de la ejecución de un solo escenario base.</w:t>
+        <w:t>Escenario y Simulación (1:N). Un escenario puede ser ejecutado o simulado muchas veces. Por ejemplo: si cambias el software de simulación o quieres correr de nuevo la misma hipótesis en fechas distintas. Una simulación proviene de la ejecución de un solo escenario base.</w:t>
       </w:r>
     </w:p>
     <w:p>
@@ -1191,15 +1723,7 @@
         </w:numPr>
       </w:pPr>
       <w:r>
-        <w:t>Simulación y Datos (</w:t>
-      </w:r>
-      <w:proofErr w:type="gramStart"/>
-      <w:r>
-        <w:t>1:N</w:t>
-      </w:r>
-      <w:proofErr w:type="gramEnd"/>
-      <w:r>
-        <w:t>). Una simulación genera muchos datos proyectados (para cada año de 1900 a 2100 y para cada variable medida). Un dato proyectado pertenece a una sola simulación.</w:t>
+        <w:t>Simulación y Datos (1:N). Una simulación genera muchos datos proyectados (para cada año de 1900 a 2100 y para cada variable medida). Un dato proyectado pertenece a una sola simulación.</w:t>
       </w:r>
     </w:p>
     <w:p>
@@ -1211,15 +1735,43 @@
         </w:numPr>
       </w:pPr>
       <w:r>
-        <w:t>Variable y Datos (</w:t>
-      </w:r>
-      <w:proofErr w:type="gramStart"/>
-      <w:r>
-        <w:t>1:N</w:t>
-      </w:r>
-      <w:proofErr w:type="gramEnd"/>
-      <w:r>
-        <w:t>). Una variable tendrá muchos datos proyectados guardados en la base de datos. Un dato proyectado corresponde al valor de una sola variable.</w:t>
+        <w:t>Variable y Datos (1:N). Una variable tendrá muchos datos proyectados guardados en la base de datos. Un dato proyectado corresponde al valor de una sola variable.</w:t>
+      </w:r>
+    </w:p>
+    <w:p>
+      <w:pPr>
+        <w:pStyle w:val="Prrafodelista"/>
+        <w:numPr>
+          <w:ilvl w:val="0"/>
+          <w:numId w:val="4"/>
+        </w:numPr>
+      </w:pPr>
+      <w:r>
+        <w:t>Variable y Relación Causal (1:N). Una variable puede ser la afectada en muchas relaciones causales, y al mismo tiempo puede ser la influyente en muchas otras. Una relación causal específica conecta máximo 3 variables: la afectada y dos influyentes.</w:t>
+      </w:r>
+    </w:p>
+    <w:p>
+      <w:pPr>
+        <w:pStyle w:val="Prrafodelista"/>
+        <w:numPr>
+          <w:ilvl w:val="0"/>
+          <w:numId w:val="4"/>
+        </w:numPr>
+      </w:pPr>
+      <w:r>
+        <w:t>Variable y Relación Auxiliar (1:N). Una variable puede ser la auxiliar derivada en una relación, y otra puede ser la base. Cada fila de relación auxiliar conecta exactamente 2 variables.</w:t>
+      </w:r>
+    </w:p>
+    <w:p>
+      <w:pPr>
+        <w:pStyle w:val="Prrafodelista"/>
+        <w:numPr>
+          <w:ilvl w:val="0"/>
+          <w:numId w:val="4"/>
+        </w:numPr>
+      </w:pPr>
+      <w:r>
+        <w:t>Variable y Tabla de Búsqueda (1:N). Una variable puede tener varios tramos de umbral definidos, y esos tramos se evalúan contra el valor de otra variable condición.</w:t>
       </w:r>
     </w:p>
     <w:p>
@@ -1238,6 +1790,43 @@
     </w:p>
     <w:p>
       <w:pPr>
+        <w:pStyle w:val="Prrafodelista"/>
+        <w:numPr>
+          <w:ilvl w:val="0"/>
+          <w:numId w:val="6"/>
+        </w:numPr>
+      </w:pPr>
+      <w:r>
+        <w:t>Las Tablas Escenario, Variable, Parámetro, RC, RA y TL son tablas manejados de forma manual. Funcionan como un libreto, se define los valores iniciales (E, V y P) y cómo interactúan las variables (RC, RA, TL).</w:t>
+      </w:r>
+    </w:p>
+    <w:p>
+      <w:pPr>
+        <w:pStyle w:val="Prrafodelista"/>
+        <w:numPr>
+          <w:ilvl w:val="0"/>
+          <w:numId w:val="6"/>
+        </w:numPr>
+      </w:pPr>
+      <w:r>
+        <w:lastRenderedPageBreak/>
+        <w:t>En el caso de Dato Proyectado y Simulación, son automatizados mediante un procedimiento almacenado llamado “exec_simulacion”. Quise hacer que la función sea universal, evitando que ningún escenario específico esté quemado en el código. Por eso he creado 3 tablas nuevas para cualquier escenario a futuro sin modificar la función.</w:t>
+      </w:r>
+    </w:p>
+    <w:p>
+      <w:pPr>
+        <w:pStyle w:val="Prrafodelista"/>
+        <w:numPr>
+          <w:ilvl w:val="0"/>
+          <w:numId w:val="6"/>
+        </w:numPr>
+      </w:pPr>
+      <w:r>
+        <w:t>El motor de cálculo interno usa Numeric(30, 10) para los valores en tránsito durante la simulación, para evitar desbordamientos con variables de gran magnitud (como la población que puede superar los 10 mil millones en el futuro).</w:t>
+      </w:r>
+    </w:p>
+    <w:p>
+      <w:pPr>
         <w:pStyle w:val="Ttulo1"/>
         <w:rPr>
           <w:rFonts w:ascii="Cambria" w:hAnsi="Cambria"/>
@@ -1247,7 +1836,6 @@
         <w:rPr>
           <w:rFonts w:ascii="Cambria" w:hAnsi="Cambria"/>
         </w:rPr>
-        <w:lastRenderedPageBreak/>
         <w:t>Implementación</w:t>
       </w:r>
     </w:p>
@@ -1256,6 +1844,9 @@
         <w:jc w:val="center"/>
       </w:pPr>
       <w:r>
+        <w:rPr>
+          <w:noProof/>
+        </w:rPr>
         <w:drawing>
           <wp:inline distT="0" distB="0" distL="0" distR="0" wp14:anchorId="3CB7E2CA" wp14:editId="54FDD1F6">
             <wp:extent cx="2952750" cy="3337891"/>
@@ -1293,6 +1884,9 @@
         </w:drawing>
       </w:r>
       <w:r>
+        <w:rPr>
+          <w:noProof/>
+        </w:rPr>
         <w:drawing>
           <wp:inline distT="0" distB="0" distL="0" distR="0" wp14:anchorId="71324305" wp14:editId="62C45624">
             <wp:extent cx="3840480" cy="1349252"/>
@@ -1344,119 +1938,7 @@
         <w:t>Pruebas</w:t>
       </w:r>
     </w:p>
-    <w:p>
-      <w:pPr>
-        <w:pStyle w:val="Ttulo2"/>
-        <w:rPr>
-          <w:rFonts w:ascii="Cambria" w:hAnsi="Cambria"/>
-        </w:rPr>
-      </w:pPr>
-      <w:r>
-        <w:rPr>
-          <w:rFonts w:ascii="Cambria" w:hAnsi="Cambria"/>
-        </w:rPr>
-        <w:t>Crisis Maltusiana sobre la Madera</w:t>
-      </w:r>
-    </w:p>
-    <w:p>
-      <w:pPr>
-        <w:pStyle w:val="Subttulo"/>
-        <w:rPr>
-          <w:rFonts w:ascii="Cambria" w:hAnsi="Cambria"/>
-        </w:rPr>
-      </w:pPr>
-      <w:r>
-        <w:rPr>
-          <w:rFonts w:ascii="Cambria" w:hAnsi="Cambria"/>
-        </w:rPr>
-        <w:t>Sector</w:t>
-      </w:r>
-    </w:p>
-    <w:p>
-      <w:pPr>
-        <w:pStyle w:val="Subttulo"/>
-        <w:rPr>
-          <w:rFonts w:ascii="Cambria" w:hAnsi="Cambria"/>
-        </w:rPr>
-      </w:pPr>
-      <w:r>
-        <w:rPr>
-          <w:rFonts w:ascii="Cambria" w:hAnsi="Cambria"/>
-        </w:rPr>
-        <w:t>Escenario</w:t>
-      </w:r>
-    </w:p>
-    <w:p>
-      <w:pPr>
-        <w:pStyle w:val="Subttulo"/>
-        <w:rPr>
-          <w:rFonts w:ascii="Cambria" w:hAnsi="Cambria"/>
-        </w:rPr>
-      </w:pPr>
-      <w:r>
-        <w:rPr>
-          <w:rFonts w:ascii="Cambria" w:hAnsi="Cambria"/>
-        </w:rPr>
-        <w:t>Variable</w:t>
-      </w:r>
-    </w:p>
-    <w:p>
-      <w:pPr>
-        <w:pStyle w:val="Subttulo"/>
-        <w:rPr>
-          <w:rFonts w:ascii="Cambria" w:hAnsi="Cambria"/>
-        </w:rPr>
-      </w:pPr>
-      <w:r>
-        <w:rPr>
-          <w:rFonts w:ascii="Cambria" w:hAnsi="Cambria"/>
-        </w:rPr>
-        <w:t>Parámetros</w:t>
-      </w:r>
-    </w:p>
-    <w:p>
-      <w:pPr>
-        <w:pStyle w:val="Subttulo"/>
-        <w:rPr>
-          <w:rFonts w:ascii="Cambria" w:hAnsi="Cambria"/>
-        </w:rPr>
-      </w:pPr>
-      <w:r>
-        <w:rPr>
-          <w:rFonts w:ascii="Cambria" w:hAnsi="Cambria"/>
-        </w:rPr>
-        <w:t>Resultados</w:t>
-      </w:r>
-    </w:p>
-    <w:p>
-      <w:pPr>
-        <w:pStyle w:val="Ttulo2"/>
-        <w:rPr>
-          <w:rFonts w:ascii="Cambria" w:hAnsi="Cambria"/>
-        </w:rPr>
-      </w:pPr>
-      <w:r>
-        <w:rPr>
-          <w:rFonts w:ascii="Cambria" w:hAnsi="Cambria"/>
-        </w:rPr>
-        <w:lastRenderedPageBreak/>
-        <w:t>Establecimiento de Zonas Económicas Especiales</w:t>
-      </w:r>
-    </w:p>
-    <w:p>
-      <w:pPr>
-        <w:pStyle w:val="Ttulo2"/>
-        <w:rPr>
-          <w:rFonts w:ascii="Cambria" w:hAnsi="Cambria"/>
-        </w:rPr>
-      </w:pPr>
-      <w:r>
-        <w:rPr>
-          <w:rFonts w:ascii="Cambria" w:hAnsi="Cambria"/>
-        </w:rPr>
-        <w:t>Pacto Multisector sobre el Agua</w:t>
-      </w:r>
-    </w:p>
+    <w:p/>
     <w:sectPr>
       <w:pgSz w:w="12240" w:h="15840"/>
       <w:pgMar w:top="1417" w:right="1701" w:bottom="1417" w:left="1701" w:header="708" w:footer="708" w:gutter="0"/>
@@ -1470,6 +1952,92 @@
 <file path=word/numbering.xml><?xml version="1.0" encoding="utf-8"?>
 <w:numbering xmlns:wpc="http://schemas.microsoft.com/office/word/2010/wordprocessingCanvas" xmlns:cx="http://schemas.microsoft.com/office/drawing/2014/chartex" xmlns:cx1="http://schemas.microsoft.com/office/drawing/2015/9/8/chartex" xmlns:cx2="http://schemas.microsoft.com/office/drawing/2015/10/21/chartex" xmlns:cx3="http://schemas.microsoft.com/office/drawing/2016/5/9/chartex" xmlns:cx4="http://schemas.microsoft.com/office/drawing/2016/5/10/chartex" xmlns:cx5="http://schemas.microsoft.com/office/drawing/2016/5/11/chartex" xmlns:cx6="http://schemas.microsoft.com/office/drawing/2016/5/12/chartex" xmlns:cx7="http://schemas.microsoft.com/office/drawing/2016/5/13/chartex" xmlns:cx8="http://schemas.microsoft.com/office/drawing/2016/5/14/chartex" xmlns:mc="http://schemas.openxmlformats.org/markup-compatibility/2006" xmlns:aink="http://schemas.microsoft.com/office/drawing/2016/ink" xmlns:am3d="http://schemas.microsoft.com/office/drawing/2017/model3d" xmlns:o="urn:schemas-microsoft-com:office:office" xmlns:oel="http://schemas.microsoft.com/office/2019/extlst" xmlns:r="http://schemas.openxmlformats.org/officeDocument/2006/relationships" xmlns:m="http://schemas.openxmlformats.org/officeDocument/2006/math" xmlns:v="urn:schemas-microsoft-com:vml" xmlns:wp14="http://schemas.microsoft.com/office/word/2010/wordprocessingDrawing" xmlns:wp="http://schemas.openxmlformats.org/drawingml/2006/wordprocessingDrawing" xmlns:w10="urn:schemas-microsoft-com:office:word" xmlns:w="http://schemas.openxmlformats.org/wordprocessingml/2006/main" xmlns:w14="http://schemas.microsoft.com/office/word/2010/wordml" xmlns:w15="http://schemas.microsoft.com/office/word/2012/wordml" xmlns:w16cex="http://schemas.microsoft.com/office/word/2018/wordml/cex" xmlns:w16cid="http://schemas.microsoft.com/office/word/2016/wordml/cid" xmlns:w16="http://schemas.microsoft.com/office/word/2018/wordml" xmlns:w16du="http://schemas.microsoft.com/office/word/2023/wordml/word16du" xmlns:w16sdtdh="http://schemas.microsoft.com/office/word/2020/wordml/sdtdatahash" xmlns:w16sdtfl="http://schemas.microsoft.com/office/word/2024/wordml/sdtformatlock" xmlns:w16se="http://schemas.microsoft.com/office/word/2015/wordml/symex" xmlns:wpg="http://schemas.microsoft.com/office/word/2010/wordprocessingGroup" xmlns:wpi="http://schemas.microsoft.com/office/word/2010/wordprocessingInk" xmlns:wne="http://schemas.microsoft.com/office/word/2006/wordml" xmlns:wps="http://schemas.microsoft.com/office/word/2010/wordprocessingShape" mc:Ignorable="w14 w15 w16se w16cid w16 w16cex w16sdtdh w16sdtfl w16du wp14">
   <w:abstractNum w:abstractNumId="0" w15:restartNumberingAfterBreak="0">
+    <w:nsid w:val="1B4D1F0B"/>
+    <w:multiLevelType w:val="hybridMultilevel"/>
+    <w:tmpl w:val="36D86FEC"/>
+    <w:lvl w:ilvl="0" w:tplc="080A000F">
+      <w:start w:val="1"/>
+      <w:numFmt w:val="decimal"/>
+      <w:lvlText w:val="%1."/>
+      <w:lvlJc w:val="left"/>
+      <w:pPr>
+        <w:ind w:left="720" w:hanging="360"/>
+      </w:pPr>
+    </w:lvl>
+    <w:lvl w:ilvl="1" w:tplc="080A0019" w:tentative="1">
+      <w:start w:val="1"/>
+      <w:numFmt w:val="lowerLetter"/>
+      <w:lvlText w:val="%2."/>
+      <w:lvlJc w:val="left"/>
+      <w:pPr>
+        <w:ind w:left="1440" w:hanging="360"/>
+      </w:pPr>
+    </w:lvl>
+    <w:lvl w:ilvl="2" w:tplc="080A001B" w:tentative="1">
+      <w:start w:val="1"/>
+      <w:numFmt w:val="lowerRoman"/>
+      <w:lvlText w:val="%3."/>
+      <w:lvlJc w:val="right"/>
+      <w:pPr>
+        <w:ind w:left="2160" w:hanging="180"/>
+      </w:pPr>
+    </w:lvl>
+    <w:lvl w:ilvl="3" w:tplc="080A000F" w:tentative="1">
+      <w:start w:val="1"/>
+      <w:numFmt w:val="decimal"/>
+      <w:lvlText w:val="%4."/>
+      <w:lvlJc w:val="left"/>
+      <w:pPr>
+        <w:ind w:left="2880" w:hanging="360"/>
+      </w:pPr>
+    </w:lvl>
+    <w:lvl w:ilvl="4" w:tplc="080A0019" w:tentative="1">
+      <w:start w:val="1"/>
+      <w:numFmt w:val="lowerLetter"/>
+      <w:lvlText w:val="%5."/>
+      <w:lvlJc w:val="left"/>
+      <w:pPr>
+        <w:ind w:left="3600" w:hanging="360"/>
+      </w:pPr>
+    </w:lvl>
+    <w:lvl w:ilvl="5" w:tplc="080A001B" w:tentative="1">
+      <w:start w:val="1"/>
+      <w:numFmt w:val="lowerRoman"/>
+      <w:lvlText w:val="%6."/>
+      <w:lvlJc w:val="right"/>
+      <w:pPr>
+        <w:ind w:left="4320" w:hanging="180"/>
+      </w:pPr>
+    </w:lvl>
+    <w:lvl w:ilvl="6" w:tplc="080A000F" w:tentative="1">
+      <w:start w:val="1"/>
+      <w:numFmt w:val="decimal"/>
+      <w:lvlText w:val="%7."/>
+      <w:lvlJc w:val="left"/>
+      <w:pPr>
+        <w:ind w:left="5040" w:hanging="360"/>
+      </w:pPr>
+    </w:lvl>
+    <w:lvl w:ilvl="7" w:tplc="080A0019" w:tentative="1">
+      <w:start w:val="1"/>
+      <w:numFmt w:val="lowerLetter"/>
+      <w:lvlText w:val="%8."/>
+      <w:lvlJc w:val="left"/>
+      <w:pPr>
+        <w:ind w:left="5760" w:hanging="360"/>
+      </w:pPr>
+    </w:lvl>
+    <w:lvl w:ilvl="8" w:tplc="080A001B" w:tentative="1">
+      <w:start w:val="1"/>
+      <w:numFmt w:val="lowerRoman"/>
+      <w:lvlText w:val="%9."/>
+      <w:lvlJc w:val="right"/>
+      <w:pPr>
+        <w:ind w:left="6480" w:hanging="180"/>
+      </w:pPr>
+    </w:lvl>
+  </w:abstractNum>
+  <w:abstractNum w:abstractNumId="1" w15:restartNumberingAfterBreak="0">
     <w:nsid w:val="219A4B27"/>
     <w:multiLevelType w:val="hybridMultilevel"/>
     <w:tmpl w:val="AD1C7628"/>
@@ -1555,7 +2123,7 @@
       </w:pPr>
     </w:lvl>
   </w:abstractNum>
-  <w:abstractNum w:abstractNumId="1" w15:restartNumberingAfterBreak="0">
+  <w:abstractNum w:abstractNumId="2" w15:restartNumberingAfterBreak="0">
     <w:nsid w:val="443325A2"/>
     <w:multiLevelType w:val="hybridMultilevel"/>
     <w:tmpl w:val="C730F26E"/>
@@ -1667,7 +2235,7 @@
       </w:rPr>
     </w:lvl>
   </w:abstractNum>
-  <w:abstractNum w:abstractNumId="2" w15:restartNumberingAfterBreak="0">
+  <w:abstractNum w:abstractNumId="3" w15:restartNumberingAfterBreak="0">
     <w:nsid w:val="503676AD"/>
     <w:multiLevelType w:val="hybridMultilevel"/>
     <w:tmpl w:val="149646F8"/>
@@ -1779,7 +2347,7 @@
       </w:rPr>
     </w:lvl>
   </w:abstractNum>
-  <w:abstractNum w:abstractNumId="3" w15:restartNumberingAfterBreak="0">
+  <w:abstractNum w:abstractNumId="4" w15:restartNumberingAfterBreak="0">
     <w:nsid w:val="652F7914"/>
     <w:multiLevelType w:val="hybridMultilevel"/>
     <w:tmpl w:val="1FEE677E"/>
@@ -1891,7 +2459,7 @@
       </w:rPr>
     </w:lvl>
   </w:abstractNum>
-  <w:abstractNum w:abstractNumId="4" w15:restartNumberingAfterBreak="0">
+  <w:abstractNum w:abstractNumId="5" w15:restartNumberingAfterBreak="0">
     <w:nsid w:val="7CB176A2"/>
     <w:multiLevelType w:val="hybridMultilevel"/>
     <w:tmpl w:val="321CC7EE"/>
@@ -1981,19 +2549,22 @@
     </w:lvl>
   </w:abstractNum>
   <w:num w:numId="1" w16cid:durableId="1045446328">
+    <w:abstractNumId w:val="4"/>
+  </w:num>
+  <w:num w:numId="2" w16cid:durableId="395471610">
     <w:abstractNumId w:val="3"/>
   </w:num>
-  <w:num w:numId="2" w16cid:durableId="395471610">
+  <w:num w:numId="3" w16cid:durableId="923495331">
+    <w:abstractNumId w:val="1"/>
+  </w:num>
+  <w:num w:numId="4" w16cid:durableId="501312205">
+    <w:abstractNumId w:val="5"/>
+  </w:num>
+  <w:num w:numId="5" w16cid:durableId="90317740">
     <w:abstractNumId w:val="2"/>
   </w:num>
-  <w:num w:numId="3" w16cid:durableId="923495331">
+  <w:num w:numId="6" w16cid:durableId="1869752926">
     <w:abstractNumId w:val="0"/>
-  </w:num>
-  <w:num w:numId="4" w16cid:durableId="501312205">
-    <w:abstractNumId w:val="4"/>
-  </w:num>
-  <w:num w:numId="5" w16cid:durableId="90317740">
-    <w:abstractNumId w:val="1"/>
   </w:num>
 </w:numbering>
 </file>

</xml_diff>